<commit_message>
Updated student declaration and certification documents by removing redundant supervisor details and ensuring consistent formatting for signatures across all pages.
</commit_message>
<xml_diff>
--- a/Page One.docx
+++ b/Page One.docx
@@ -62,6 +62,7 @@
           <w:lang w:val="en-US"/>
         </w:rPr>
       </w:pPr>
+      <w:proofErr w:type="spellStart"/>
       <w:r>
         <w:rPr>
           <w:rFonts w:ascii="Times New Roman" w:hAnsi="Times New Roman" w:cs="Times New Roman"/>
@@ -71,7 +72,19 @@
           <w:szCs w:val="28"/>
           <w:lang w:val="en-US"/>
         </w:rPr>
-        <w:t>ThousandX Ventures LLP</w:t>
+        <w:t>ThousandX</w:t>
+      </w:r>
+      <w:proofErr w:type="spellEnd"/>
+      <w:r>
+        <w:rPr>
+          <w:rFonts w:ascii="Times New Roman" w:hAnsi="Times New Roman" w:cs="Times New Roman"/>
+          <w:b/>
+          <w:bCs/>
+          <w:sz w:val="28"/>
+          <w:szCs w:val="28"/>
+          <w:lang w:val="en-US"/>
+        </w:rPr>
+        <w:t xml:space="preserve"> Ventures LLP</w:t>
       </w:r>
     </w:p>
     <w:p>
@@ -402,11 +415,75 @@
           <w:rFonts w:ascii="Times New Roman" w:hAnsi="Times New Roman" w:cs="Times New Roman"/>
           <w:b/>
           <w:bCs/>
+          <w:noProof/>
           <w:sz w:val="24"/>
           <w:szCs w:val="24"/>
           <w:lang w:val="en-US"/>
         </w:rPr>
-        <w:t>Signature of the student:</w:t>
+        <w:drawing>
+          <wp:inline distT="0" distB="0" distL="0" distR="0" wp14:anchorId="56AADC7C" wp14:editId="5465BF28">
+            <wp:extent cx="865819" cy="469265"/>
+            <wp:effectExtent l="0" t="0" r="0" b="6985"/>
+            <wp:docPr id="382904474" name="Picture 1"/>
+            <wp:cNvGraphicFramePr>
+              <a:graphicFrameLocks xmlns:a="http://schemas.openxmlformats.org/drawingml/2006/main" noChangeAspect="1"/>
+            </wp:cNvGraphicFramePr>
+            <a:graphic xmlns:a="http://schemas.openxmlformats.org/drawingml/2006/main">
+              <a:graphicData uri="http://schemas.openxmlformats.org/drawingml/2006/picture">
+                <pic:pic xmlns:pic="http://schemas.openxmlformats.org/drawingml/2006/picture">
+                  <pic:nvPicPr>
+                    <pic:cNvPr id="382904474" name="Picture 382904474"/>
+                    <pic:cNvPicPr/>
+                  </pic:nvPicPr>
+                  <pic:blipFill>
+                    <a:blip r:embed="rId5" cstate="print">
+                      <a:extLst>
+                        <a:ext uri="{28A0092B-C50C-407E-A947-70E740481C1C}">
+                          <a14:useLocalDpi xmlns:a14="http://schemas.microsoft.com/office/drawing/2010/main" val="0"/>
+                        </a:ext>
+                      </a:extLst>
+                    </a:blip>
+                    <a:stretch>
+                      <a:fillRect/>
+                    </a:stretch>
+                  </pic:blipFill>
+                  <pic:spPr>
+                    <a:xfrm>
+                      <a:off x="0" y="0"/>
+                      <a:ext cx="902295" cy="489035"/>
+                    </a:xfrm>
+                    <a:prstGeom prst="rect">
+                      <a:avLst/>
+                    </a:prstGeom>
+                  </pic:spPr>
+                </pic:pic>
+              </a:graphicData>
+            </a:graphic>
+          </wp:inline>
+        </w:drawing>
+      </w:r>
+    </w:p>
+    <w:p>
+      <w:pPr>
+        <w:rPr>
+          <w:rFonts w:ascii="Times New Roman" w:hAnsi="Times New Roman" w:cs="Times New Roman"/>
+          <w:b/>
+          <w:bCs/>
+          <w:sz w:val="24"/>
+          <w:szCs w:val="24"/>
+          <w:lang w:val="en-US"/>
+        </w:rPr>
+      </w:pPr>
+      <w:r>
+        <w:rPr>
+          <w:rFonts w:ascii="Times New Roman" w:hAnsi="Times New Roman" w:cs="Times New Roman"/>
+          <w:b/>
+          <w:bCs/>
+          <w:sz w:val="24"/>
+          <w:szCs w:val="24"/>
+          <w:lang w:val="en-US"/>
+        </w:rPr>
+        <w:t>Signature of the student</w:t>
       </w:r>
     </w:p>
     <w:sectPr>

</xml_diff>